<commit_message>
info about biteqr changed
</commit_message>
<xml_diff>
--- a/Resume/ZHYLKAIDAROV.docx
+++ b/Resume/ZHYLKAIDAROV.docx
@@ -261,17 +261,8 @@
                   <w:rStyle w:val="Hyperlink"/>
                   <w:sz w:val="24"/>
                 </w:rPr>
-                <w:t>vk.com/</w:t>
+                <w:t>vk.com/nzmmsk</w:t>
               </w:r>
-              <w:proofErr w:type="spellStart"/>
-              <w:r>
-                <w:rPr>
-                  <w:rStyle w:val="Hyperlink"/>
-                  <w:sz w:val="24"/>
-                </w:rPr>
-                <w:t>nzmmsk</w:t>
-              </w:r>
-              <w:proofErr w:type="spellEnd"/>
             </w:hyperlink>
           </w:p>
           <w:p>
@@ -293,17 +284,8 @@
                   <w:rStyle w:val="Hyperlink"/>
                   <w:sz w:val="24"/>
                 </w:rPr>
-                <w:t>t.me/</w:t>
+                <w:t>t.me/nzmmsk</w:t>
               </w:r>
-              <w:proofErr w:type="spellStart"/>
-              <w:r>
-                <w:rPr>
-                  <w:rStyle w:val="Hyperlink"/>
-                  <w:sz w:val="24"/>
-                </w:rPr>
-                <w:t>nzmmsk</w:t>
-              </w:r>
-              <w:proofErr w:type="spellEnd"/>
             </w:hyperlink>
           </w:p>
           <w:p>
@@ -333,19 +315,11 @@
                 <w:sz w:val="24"/>
               </w:rPr>
             </w:pPr>
-            <w:proofErr w:type="spellStart"/>
             <w:r>
               <w:rPr>
                 <w:sz w:val="24"/>
               </w:rPr>
-              <w:t>Github</w:t>
-            </w:r>
-            <w:proofErr w:type="spellEnd"/>
-            <w:r>
-              <w:rPr>
-                <w:sz w:val="24"/>
-              </w:rPr>
-              <w:t xml:space="preserve">: </w:t>
+              <w:t xml:space="preserve">Github: </w:t>
             </w:r>
             <w:hyperlink r:id="rId13" w:history="1">
               <w:r>
@@ -353,17 +327,8 @@
                   <w:rStyle w:val="Hyperlink"/>
                   <w:sz w:val="24"/>
                 </w:rPr>
-                <w:t>github.com/</w:t>
+                <w:t>github.com/nurgitlab</w:t>
               </w:r>
-              <w:proofErr w:type="spellStart"/>
-              <w:r>
-                <w:rPr>
-                  <w:rStyle w:val="Hyperlink"/>
-                  <w:sz w:val="24"/>
-                </w:rPr>
-                <w:t>nurgitlab</w:t>
-              </w:r>
-              <w:proofErr w:type="spellEnd"/>
             </w:hyperlink>
           </w:p>
           <w:p>
@@ -617,20 +582,10 @@
               <w:t>Applied Mathematics and Computer Science</w:t>
             </w:r>
             <w:r>
-              <w:t>, Saint-Petersburg University (</w:t>
-            </w:r>
-            <w:proofErr w:type="spellStart"/>
-            <w:proofErr w:type="gramStart"/>
-            <w:r>
-              <w:t>B</w:t>
-            </w:r>
-            <w:r>
-              <w:t>achelors</w:t>
-            </w:r>
-            <w:proofErr w:type="spellEnd"/>
-            <w:proofErr w:type="gramEnd"/>
-            <w:r>
-              <w:t xml:space="preserve"> </w:t>
+              <w:t>, Saint-Petersburg University (B</w:t>
+            </w:r>
+            <w:r>
+              <w:t xml:space="preserve">achelors </w:t>
             </w:r>
             <w:r>
               <w:t>d</w:t>
@@ -800,23 +755,7 @@
                 <w:sz w:val="28"/>
                 <w:szCs w:val="28"/>
               </w:rPr>
-              <w:t xml:space="preserve">Hooks, Redux, CSS3, HTML5, SCSS, CSS in JS, </w:t>
-            </w:r>
-            <w:proofErr w:type="spellStart"/>
-            <w:r>
-              <w:rPr>
-                <w:sz w:val="28"/>
-                <w:szCs w:val="28"/>
-              </w:rPr>
-              <w:t>PostCSS</w:t>
-            </w:r>
-            <w:proofErr w:type="spellEnd"/>
-            <w:r>
-              <w:rPr>
-                <w:sz w:val="28"/>
-                <w:szCs w:val="28"/>
-              </w:rPr>
-              <w:t xml:space="preserve"> Loader</w:t>
+              <w:t>Hooks, Redux, CSS3, HTML5, SCSS, CSS in JS, PostCSS Loader</w:t>
             </w:r>
           </w:p>
           <w:p>
@@ -932,7 +871,13 @@
               <w:pStyle w:val="Text"/>
             </w:pPr>
             <w:r>
-              <w:t xml:space="preserve">Place of work: </w:t>
+              <w:t>Place of work:</w:t>
+            </w:r>
+            <w:r>
+              <w:t xml:space="preserve"> MOBILE ONLY</w:t>
+            </w:r>
+            <w:r>
+              <w:t xml:space="preserve"> </w:t>
             </w:r>
             <w:hyperlink r:id="rId14" w:history="1">
               <w:r>
@@ -2686,6 +2631,7 @@
     <w:rsidRoot w:val="00AC5740"/>
     <w:rsid w:val="00054D29"/>
     <w:rsid w:val="000D2565"/>
+    <w:rsid w:val="005170EE"/>
     <w:rsid w:val="005E5256"/>
     <w:rsid w:val="008E6B47"/>
     <w:rsid w:val="00AC5740"/>
@@ -3384,6 +3330,24 @@
 </file>
 
 <file path=customXml/item1.xml><?xml version="1.0" encoding="utf-8"?>
+<?mso-contentType ?>
+<FormTemplates xmlns="http://schemas.microsoft.com/sharepoint/v3/contenttype/forms">
+  <Display>DocumentLibraryForm</Display>
+  <Edit>DocumentLibraryForm</Edit>
+  <New>DocumentLibraryForm</New>
+</FormTemplates>
+</file>
+
+<file path=customXml/item2.xml><?xml version="1.0" encoding="utf-8"?>
+<p:properties xmlns:p="http://schemas.microsoft.com/office/2006/metadata/properties" xmlns:xsi="http://www.w3.org/2001/XMLSchema-instance" xmlns:pc="http://schemas.microsoft.com/office/infopath/2007/PartnerControls">
+  <documentManagement>
+    <MediaServiceKeyPoints xmlns="71af3243-3dd4-4a8d-8c0d-dd76da1f02a5" xsi:nil="true"/>
+    <Status xmlns="71af3243-3dd4-4a8d-8c0d-dd76da1f02a5">Not started</Status>
+  </documentManagement>
+</p:properties>
+</file>
+
+<file path=customXml/item3.xml><?xml version="1.0" encoding="utf-8"?>
 <ct:contentTypeSchema xmlns:ct="http://schemas.microsoft.com/office/2006/metadata/contentType" xmlns:ma="http://schemas.microsoft.com/office/2006/metadata/properties/metaAttributes" ct:_="" ma:_="" ma:contentTypeName="Document" ma:contentTypeID="0x01010079F111ED35F8CC479449609E8A0923A6" ma:contentTypeVersion="12" ma:contentTypeDescription="Create a new document." ma:contentTypeScope="" ma:versionID="fa6e671f1cd7e4d96ff9652be322dd5e">
   <xsd:schema xmlns:xsd="http://www.w3.org/2001/XMLSchema" xmlns:xs="http://www.w3.org/2001/XMLSchema" xmlns:p="http://schemas.microsoft.com/office/2006/metadata/properties" xmlns:ns2="71af3243-3dd4-4a8d-8c0d-dd76da1f02a5" xmlns:ns3="16c05727-aa75-4e4a-9b5f-8a80a1165891" targetNamespace="http://schemas.microsoft.com/office/2006/metadata/properties" ma:root="true" ma:fieldsID="4e2496f70b101db0b8013f30a071bbf7" ns2:_="" ns3:_="">
     <xsd:import namespace="71af3243-3dd4-4a8d-8c0d-dd76da1f02a5"/>
@@ -3604,25 +3568,25 @@
 </ct:contentTypeSchema>
 </file>
 
-<file path=customXml/item2.xml><?xml version="1.0" encoding="utf-8"?>
-<p:properties xmlns:p="http://schemas.microsoft.com/office/2006/metadata/properties" xmlns:xsi="http://www.w3.org/2001/XMLSchema-instance" xmlns:pc="http://schemas.microsoft.com/office/infopath/2007/PartnerControls">
-  <documentManagement>
-    <MediaServiceKeyPoints xmlns="71af3243-3dd4-4a8d-8c0d-dd76da1f02a5" xsi:nil="true"/>
-    <Status xmlns="71af3243-3dd4-4a8d-8c0d-dd76da1f02a5">Not started</Status>
-  </documentManagement>
-</p:properties>
+<file path=customXml/itemProps1.xml><?xml version="1.0" encoding="utf-8"?>
+<ds:datastoreItem xmlns:ds="http://schemas.openxmlformats.org/officeDocument/2006/customXml" ds:itemID="{C3ED917E-6B3F-4995-8090-FD9CFEE66038}">
+  <ds:schemaRefs>
+    <ds:schemaRef ds:uri="http://schemas.microsoft.com/sharepoint/v3/contenttype/forms"/>
+  </ds:schemaRefs>
+</ds:datastoreItem>
 </file>
 
-<file path=customXml/item3.xml><?xml version="1.0" encoding="utf-8"?>
-<?mso-contentType ?>
-<FormTemplates xmlns="http://schemas.microsoft.com/sharepoint/v3/contenttype/forms">
-  <Display>DocumentLibraryForm</Display>
-  <Edit>DocumentLibraryForm</Edit>
-  <New>DocumentLibraryForm</New>
-</FormTemplates>
+<file path=customXml/itemProps2.xml><?xml version="1.0" encoding="utf-8"?>
+<ds:datastoreItem xmlns:ds="http://schemas.openxmlformats.org/officeDocument/2006/customXml" ds:itemID="{F1735428-6F95-4096-840F-2DD96B16B624}">
+  <ds:schemaRefs>
+    <ds:schemaRef ds:uri="http://schemas.microsoft.com/office/2006/metadata/properties"/>
+    <ds:schemaRef ds:uri="http://schemas.microsoft.com/office/infopath/2007/PartnerControls"/>
+    <ds:schemaRef ds:uri="71af3243-3dd4-4a8d-8c0d-dd76da1f02a5"/>
+  </ds:schemaRefs>
+</ds:datastoreItem>
 </file>
 
-<file path=customXml/itemProps1.xml><?xml version="1.0" encoding="utf-8"?>
+<file path=customXml/itemProps3.xml><?xml version="1.0" encoding="utf-8"?>
 <ds:datastoreItem xmlns:ds="http://schemas.openxmlformats.org/officeDocument/2006/customXml" ds:itemID="{647FEFD4-54E2-43C2-B579-757DDE7F1A35}">
   <ds:schemaRefs>
     <ds:schemaRef ds:uri="http://schemas.microsoft.com/office/2006/metadata/contentType"/>
@@ -3639,22 +3603,4 @@
     <ds:schemaRef ds:uri="http://schemas.microsoft.com/internal/obd"/>
   </ds:schemaRefs>
 </ds:datastoreItem>
-</file>
-
-<file path=customXml/itemProps2.xml><?xml version="1.0" encoding="utf-8"?>
-<ds:datastoreItem xmlns:ds="http://schemas.openxmlformats.org/officeDocument/2006/customXml" ds:itemID="{F1735428-6F95-4096-840F-2DD96B16B624}">
-  <ds:schemaRefs>
-    <ds:schemaRef ds:uri="http://schemas.microsoft.com/office/2006/metadata/properties"/>
-    <ds:schemaRef ds:uri="http://schemas.microsoft.com/office/infopath/2007/PartnerControls"/>
-    <ds:schemaRef ds:uri="71af3243-3dd4-4a8d-8c0d-dd76da1f02a5"/>
-  </ds:schemaRefs>
-</ds:datastoreItem>
-</file>
-
-<file path=customXml/itemProps3.xml><?xml version="1.0" encoding="utf-8"?>
-<ds:datastoreItem xmlns:ds="http://schemas.openxmlformats.org/officeDocument/2006/customXml" ds:itemID="{C3ED917E-6B3F-4995-8090-FD9CFEE66038}">
-  <ds:schemaRefs>
-    <ds:schemaRef ds:uri="http://schemas.microsoft.com/sharepoint/v3/contenttype/forms"/>
-  </ds:schemaRefs>
-</ds:datastoreItem>
 </file>
</xml_diff>